<commit_message>
Final wrap up of report figures and readme
</commit_message>
<xml_diff>
--- a/01_documentation/Process_Workflow.docx
+++ b/01_documentation/Process_Workflow.docx
@@ -8,7 +8,7 @@
           <w:noProof/>
         </w:rPr>
         <w:drawing>
-          <wp:inline distT="0" distB="0" distL="0" distR="0" wp14:anchorId="197FA58F" wp14:editId="76004688">
+          <wp:inline distT="0" distB="0" distL="0" distR="0" wp14:anchorId="197FA58F" wp14:editId="6C640369">
             <wp:extent cx="5486400" cy="3200400"/>
             <wp:effectExtent l="38100" t="0" r="19050" b="0"/>
             <wp:docPr id="523751107" name="Diagram 1"/>
@@ -2292,7 +2292,15 @@
         <a:p>
           <a:r>
             <a:rPr lang="en-US"/>
-            <a:t>Train TF-IDF Model</a:t>
+            <a:t>Train </a:t>
+          </a:r>
+          <a:r>
+            <a:rPr lang="en-US" b="0"/>
+            <a:t>GNB</a:t>
+          </a:r>
+          <a:r>
+            <a:rPr lang="en-US"/>
+            <a:t> Model</a:t>
           </a:r>
         </a:p>
       </dgm:t>
@@ -2320,42 +2328,6 @@
       </dgm:t>
     </dgm:pt>
     <dgm:pt modelId="{C8867FA1-6710-4082-B519-B85483DDAF6F}">
-      <dgm:prSet phldrT="[Text]"/>
-      <dgm:spPr/>
-      <dgm:t>
-        <a:bodyPr/>
-        <a:lstStyle/>
-        <a:p>
-          <a:r>
-            <a:rPr lang="en-US"/>
-            <a:t>Prepared with Python</a:t>
-          </a:r>
-        </a:p>
-      </dgm:t>
-    </dgm:pt>
-    <dgm:pt modelId="{C37C74AB-ADCA-45FC-9F6D-7007ABB410F3}" type="parTrans" cxnId="{B84CE81A-7E9E-4AF2-9CC0-0083C6FFE06F}">
-      <dgm:prSet/>
-      <dgm:spPr/>
-      <dgm:t>
-        <a:bodyPr/>
-        <a:lstStyle/>
-        <a:p>
-          <a:endParaRPr lang="en-US"/>
-        </a:p>
-      </dgm:t>
-    </dgm:pt>
-    <dgm:pt modelId="{9595CD01-706C-4741-9EE5-453B18CBC3FE}" type="sibTrans" cxnId="{B84CE81A-7E9E-4AF2-9CC0-0083C6FFE06F}">
-      <dgm:prSet/>
-      <dgm:spPr/>
-      <dgm:t>
-        <a:bodyPr/>
-        <a:lstStyle/>
-        <a:p>
-          <a:endParaRPr lang="en-US"/>
-        </a:p>
-      </dgm:t>
-    </dgm:pt>
-    <dgm:pt modelId="{25B0B60A-1247-43C8-8610-A106D86109C8}">
       <dgm:prSet phldrT="[Text]"/>
       <dgm:spPr/>
       <dgm:t>
@@ -2370,7 +2342,7 @@
         </a:p>
       </dgm:t>
     </dgm:pt>
-    <dgm:pt modelId="{22D091CD-FF2E-47B4-BFFA-A4C6214C61EB}" type="parTrans" cxnId="{63392C10-623D-4D5F-8348-8E0E0A4DEFB3}">
+    <dgm:pt modelId="{C37C74AB-ADCA-45FC-9F6D-7007ABB410F3}" type="parTrans" cxnId="{B84CE81A-7E9E-4AF2-9CC0-0083C6FFE06F}">
       <dgm:prSet/>
       <dgm:spPr/>
       <dgm:t>
@@ -2381,7 +2353,7 @@
         </a:p>
       </dgm:t>
     </dgm:pt>
-    <dgm:pt modelId="{4EC736C0-3E8A-4FA0-BFD2-DF6349DB87AB}" type="sibTrans" cxnId="{63392C10-623D-4D5F-8348-8E0E0A4DEFB3}">
+    <dgm:pt modelId="{9595CD01-706C-4741-9EE5-453B18CBC3FE}" type="sibTrans" cxnId="{B84CE81A-7E9E-4AF2-9CC0-0083C6FFE06F}">
       <dgm:prSet/>
       <dgm:spPr/>
       <dgm:t>
@@ -2500,6 +2472,42 @@
         </a:p>
       </dgm:t>
     </dgm:pt>
+    <dgm:pt modelId="{3E5A7E7E-916C-48F6-A1AE-B5CEAC4BF2AD}">
+      <dgm:prSet phldrT="[Text]"/>
+      <dgm:spPr/>
+      <dgm:t>
+        <a:bodyPr/>
+        <a:lstStyle/>
+        <a:p>
+          <a:r>
+            <a:rPr lang="en-US"/>
+            <a:t>TF-IDF</a:t>
+          </a:r>
+        </a:p>
+      </dgm:t>
+    </dgm:pt>
+    <dgm:pt modelId="{DC8FED75-9793-4848-92F7-F55CB5078AD5}" type="parTrans" cxnId="{8918034A-B3A2-4F8B-95E7-0953E3EF18A4}">
+      <dgm:prSet/>
+      <dgm:spPr/>
+      <dgm:t>
+        <a:bodyPr/>
+        <a:lstStyle/>
+        <a:p>
+          <a:endParaRPr lang="en-US"/>
+        </a:p>
+      </dgm:t>
+    </dgm:pt>
+    <dgm:pt modelId="{A841E4AF-A7E3-4619-91B2-7455AD8F4505}" type="sibTrans" cxnId="{8918034A-B3A2-4F8B-95E7-0953E3EF18A4}">
+      <dgm:prSet/>
+      <dgm:spPr/>
+      <dgm:t>
+        <a:bodyPr/>
+        <a:lstStyle/>
+        <a:p>
+          <a:endParaRPr lang="en-US"/>
+        </a:p>
+      </dgm:t>
+    </dgm:pt>
     <dgm:pt modelId="{4BBC5EF7-6915-4E46-AF26-1226FE67E391}" type="pres">
       <dgm:prSet presAssocID="{7C565929-8483-45DA-80B7-4C4F50629C86}" presName="Name0" presStyleCnt="0">
         <dgm:presLayoutVars>
@@ -2687,7 +2695,8 @@
     <dgm:cxn modelId="{AE429007-F33D-4871-955D-D3C7349961F4}" type="presOf" srcId="{5654C58E-E5BC-4B09-9F83-24CBD70C4C19}" destId="{07D81982-048D-492D-B496-2EF850D015B8}" srcOrd="0" destOrd="0" presId="urn:microsoft.com/office/officeart/2005/8/layout/hProcess4"/>
     <dgm:cxn modelId="{1A44A407-2630-44AF-8198-DAE641E92E4D}" type="presOf" srcId="{BEFEAFD9-921F-4B70-A850-5D2BB356F5CF}" destId="{6B99DD5E-10D3-447F-BC88-F085D8ECD264}" srcOrd="0" destOrd="0" presId="urn:microsoft.com/office/officeart/2005/8/layout/hProcess4"/>
     <dgm:cxn modelId="{B8568D0D-7B65-48E0-8EF5-C91BCA00F731}" type="presOf" srcId="{AC447F5F-DD12-4AC7-AD5E-84C20FC029C5}" destId="{8FD54DE8-EF9E-4E45-AB92-6C7D05147984}" srcOrd="0" destOrd="1" presId="urn:microsoft.com/office/officeart/2005/8/layout/hProcess4"/>
-    <dgm:cxn modelId="{63392C10-623D-4D5F-8348-8E0E0A4DEFB3}" srcId="{D994047E-0926-4E46-85FA-157A0E6D2A85}" destId="{25B0B60A-1247-43C8-8610-A106D86109C8}" srcOrd="1" destOrd="0" parTransId="{22D091CD-FF2E-47B4-BFFA-A4C6214C61EB}" sibTransId="{4EC736C0-3E8A-4FA0-BFD2-DF6349DB87AB}"/>
+    <dgm:cxn modelId="{55CCFB10-5980-4940-8CC0-64237C76E593}" type="presOf" srcId="{3E5A7E7E-916C-48F6-A1AE-B5CEAC4BF2AD}" destId="{C03F8D67-B506-4E8F-9478-A24147FAD8BD}" srcOrd="0" destOrd="1" presId="urn:microsoft.com/office/officeart/2005/8/layout/hProcess4"/>
+    <dgm:cxn modelId="{2589B015-A515-4196-9917-B6532D39E7DD}" type="presOf" srcId="{3E5A7E7E-916C-48F6-A1AE-B5CEAC4BF2AD}" destId="{E8E5F3F3-14FC-47FA-8CF7-D222F7EAB2E0}" srcOrd="1" destOrd="1" presId="urn:microsoft.com/office/officeart/2005/8/layout/hProcess4"/>
     <dgm:cxn modelId="{B84CE81A-7E9E-4AF2-9CC0-0083C6FFE06F}" srcId="{D994047E-0926-4E46-85FA-157A0E6D2A85}" destId="{C8867FA1-6710-4082-B519-B85483DDAF6F}" srcOrd="0" destOrd="0" parTransId="{C37C74AB-ADCA-45FC-9F6D-7007ABB410F3}" sibTransId="{9595CD01-706C-4741-9EE5-453B18CBC3FE}"/>
     <dgm:cxn modelId="{C4842623-26AC-45E8-9161-A0595F712797}" type="presOf" srcId="{F2A38AC9-B26B-4DFE-BFD4-64B0000289ED}" destId="{AC9289B1-D0B9-46AC-BCCD-4537DBFB63F7}" srcOrd="0" destOrd="0" presId="urn:microsoft.com/office/officeart/2005/8/layout/hProcess4"/>
     <dgm:cxn modelId="{4F6FE32B-EA36-43FD-BD36-F1D1D1314327}" srcId="{D0CD1ACF-FB35-4A77-B930-ADD48B74CE57}" destId="{AC447F5F-DD12-4AC7-AD5E-84C20FC029C5}" srcOrd="1" destOrd="0" parTransId="{369EDCF2-A2FD-4A02-8EAA-67DE19259BC3}" sibTransId="{0DA04D76-2DAD-40C4-9B64-C81A3A7BFBE8}"/>
@@ -2700,9 +2709,8 @@
     <dgm:cxn modelId="{87A1D746-9003-4235-9562-4DE52C8FB896}" type="presOf" srcId="{B00D55B1-33E3-4F07-BBEE-74846BECA7A3}" destId="{415C3618-9A39-4C21-B0D7-76F26DF886E0}" srcOrd="0" destOrd="0" presId="urn:microsoft.com/office/officeart/2005/8/layout/hProcess4"/>
     <dgm:cxn modelId="{479AD067-9FE8-41F7-92BF-10174AE40175}" srcId="{7C565929-8483-45DA-80B7-4C4F50629C86}" destId="{F2A38AC9-B26B-4DFE-BFD4-64B0000289ED}" srcOrd="3" destOrd="0" parTransId="{A28146BA-1026-47AF-AA08-56053AF955F6}" sibTransId="{5D2DE89C-0614-4C25-902D-BE389BAF7CFC}"/>
     <dgm:cxn modelId="{07C92048-FA58-4D32-A4A9-13E67E2BC379}" type="presOf" srcId="{37546F4E-4398-40E9-AAD6-05BDD7F206FA}" destId="{A2630A36-E16B-46AA-BFE0-841FAAA2B543}" srcOrd="1" destOrd="0" presId="urn:microsoft.com/office/officeart/2005/8/layout/hProcess4"/>
-    <dgm:cxn modelId="{07669368-60BD-4A38-8F74-CBEC63100543}" type="presOf" srcId="{25B0B60A-1247-43C8-8610-A106D86109C8}" destId="{E8E5F3F3-14FC-47FA-8CF7-D222F7EAB2E0}" srcOrd="1" destOrd="1" presId="urn:microsoft.com/office/officeart/2005/8/layout/hProcess4"/>
+    <dgm:cxn modelId="{8918034A-B3A2-4F8B-95E7-0953E3EF18A4}" srcId="{D994047E-0926-4E46-85FA-157A0E6D2A85}" destId="{3E5A7E7E-916C-48F6-A1AE-B5CEAC4BF2AD}" srcOrd="1" destOrd="0" parTransId="{DC8FED75-9793-4848-92F7-F55CB5078AD5}" sibTransId="{A841E4AF-A7E3-4619-91B2-7455AD8F4505}"/>
     <dgm:cxn modelId="{BC1EE370-4251-4F99-B1EA-5E06B8BD51DF}" type="presOf" srcId="{D0CD1ACF-FB35-4A77-B930-ADD48B74CE57}" destId="{9AF91649-F783-454F-BB2A-F7A7EA57EC0D}" srcOrd="0" destOrd="0" presId="urn:microsoft.com/office/officeart/2005/8/layout/hProcess4"/>
-    <dgm:cxn modelId="{BB798751-17DA-418C-9E63-E7FE5C61DCDE}" type="presOf" srcId="{25B0B60A-1247-43C8-8610-A106D86109C8}" destId="{C03F8D67-B506-4E8F-9478-A24147FAD8BD}" srcOrd="0" destOrd="1" presId="urn:microsoft.com/office/officeart/2005/8/layout/hProcess4"/>
     <dgm:cxn modelId="{52E10F91-9A7D-4EA2-83ED-037F4868978D}" type="presOf" srcId="{481C06DD-75FA-41CD-A5CC-7CE4FE3A6071}" destId="{82B8EBCA-8B81-4963-8E08-2FF498B0FA02}" srcOrd="1" destOrd="0" presId="urn:microsoft.com/office/officeart/2005/8/layout/hProcess4"/>
     <dgm:cxn modelId="{FA538293-00FB-45CE-AC53-8D7870F7E467}" type="presOf" srcId="{D994047E-0926-4E46-85FA-157A0E6D2A85}" destId="{70221F80-0951-4D84-935B-277BF93E0A1D}" srcOrd="0" destOrd="0" presId="urn:microsoft.com/office/officeart/2005/8/layout/hProcess4"/>
     <dgm:cxn modelId="{DE5A22A7-786D-4970-A97A-8B449014AF1D}" type="presOf" srcId="{01DB35F2-250D-4888-A774-CE7FB4F2806E}" destId="{E8E93950-45BB-481B-8C34-1837C8343A23}" srcOrd="1" destOrd="1" presId="urn:microsoft.com/office/officeart/2005/8/layout/hProcess4"/>
@@ -3293,9 +3301,10 @@
             <a:buChar char="•"/>
           </a:pPr>
           <a:r>
-            <a:rPr lang="en-US" sz="1200" kern="1200"/>
-            <a:t>Prepared with Python</a:t>
+            <a:rPr lang="en-US" sz="1200" b="0" kern="1200"/>
+            <a:t>GaussianNB</a:t>
           </a:r>
+          <a:endParaRPr lang="en-US" sz="1200" kern="1200"/>
         </a:p>
         <a:p>
           <a:pPr marL="114300" lvl="1" indent="-114300" algn="l" defTabSz="533400">
@@ -3311,10 +3320,9 @@
             <a:buChar char="•"/>
           </a:pPr>
           <a:r>
-            <a:rPr lang="en-US" sz="1200" b="0" kern="1200"/>
-            <a:t>GaussianNB</a:t>
+            <a:rPr lang="en-US" sz="1200" kern="1200"/>
+            <a:t>TF-IDF</a:t>
           </a:r>
-          <a:endParaRPr lang="en-US" sz="1200" kern="1200"/>
         </a:p>
       </dsp:txBody>
       <dsp:txXfrm>
@@ -3442,7 +3450,15 @@
           </a:pPr>
           <a:r>
             <a:rPr lang="en-US" sz="1100" kern="1200"/>
-            <a:t>Train TF-IDF Model</a:t>
+            <a:t>Train </a:t>
+          </a:r>
+          <a:r>
+            <a:rPr lang="en-US" sz="1100" b="0" kern="1200"/>
+            <a:t>GNB</a:t>
+          </a:r>
+          <a:r>
+            <a:rPr lang="en-US" sz="1100" kern="1200"/>
+            <a:t> Model</a:t>
           </a:r>
         </a:p>
       </dsp:txBody>

</xml_diff>